<commit_message>
docs(submission): rewrite cover letter for R2 (Decision B)
The cover letter still described the R1 round (Decision D, June 2026,
old word counts). Rewritten for the R2 resubmission: Decision B context,
both reviewers' content sign-off, the three editorial fixes with the
counting-method statement (4,990/5,000 under JMIR's published method,
from ~5,430), the DOI-audit figures, the table/caption root-cause fix,
Reviewer T's captions, Reviewer Q's future-work mapping, and the
disclosed voluntary corrections. Rebuilt PDF/DOCX; package refreshed.
Note: the i-JMR revision form has no cover-letter slot; the letter is
kept as the package's summary of record.

Refs #556

Co-Authored-By: Claude Fable 5 <noreply@anthropic.com>
</commit_message>
<xml_diff>
--- a/ARCHIVED/20260712_IJMR-Submission/cover-letter.docx
+++ b/ARCHIVED/20260712_IJMR-Submission/cover-letter.docx
@@ -7,7 +7,7 @@
         <w:pStyle w:val="Date"/>
       </w:pPr>
       <w:r>
-        <w:t xml:space="preserve">June 2026</w:t>
+        <w:t xml:space="preserve">July 2026</w:t>
       </w:r>
     </w:p>
     <w:p>
@@ -35,7 +35,7 @@
         <w:pStyle w:val="BodyText"/>
       </w:pPr>
       <w:r>
-        <w:t xml:space="preserve">June 2026</w:t>
+        <w:t xml:space="preserve">July 2026</w:t>
       </w:r>
     </w:p>
     <w:p>
@@ -63,7 +63,7 @@
         <w:pStyle w:val="BodyText"/>
       </w:pPr>
       <w:r>
-        <w:t xml:space="preserve">RE: Revised Manuscript (R1) Resubmission: ms#96541, Decision D (major revision and re-review)</w:t>
+        <w:t xml:space="preserve">RE: Revised Manuscript (R2) Resubmission: ms#96541, Decision B (minor revision)</w:t>
       </w:r>
     </w:p>
     <w:p>
@@ -107,16 +107,16 @@
         <w:t xml:space="preserve"> </w:t>
       </w:r>
       <w:r>
-        <w:t xml:space="preserve">article, revised in response to Decision D (major revision and re-review).</w:t>
-      </w:r>
-    </w:p>
-    <w:bookmarkStart w:id="9" w:name="response-to-decision-d"/>
+        <w:t xml:space="preserve">article, revised in response to Decision B (minor revision).</w:t>
+      </w:r>
+    </w:p>
+    <w:bookmarkStart w:id="9" w:name="response-to-decision-b"/>
     <w:p>
       <w:pPr>
         <w:pStyle w:val="Heading2"/>
       </w:pPr>
       <w:r>
-        <w:t xml:space="preserve">Response to Decision D</w:t>
+        <w:t xml:space="preserve">Response to Decision B</w:t>
       </w:r>
     </w:p>
     <w:p>
@@ -124,7 +124,7 @@
         <w:pStyle w:val="FirstParagraph"/>
       </w:pPr>
       <w:r>
-        <w:t xml:space="preserve">I am grateful to you and to the two external reviewers for the constructive and detailed assessment. The reviews materially strengthened the manuscript, and I have addressed every editorial and reviewer comment. A full point-by-point response accompanies this resubmission; the summary below highlights the principal changes.</w:t>
+        <w:t xml:space="preserve">I am grateful to you and to both reviewers for the assessment across two rounds. Both reviewers have indicated that their content concerns are resolved; this revision addresses the three remaining editorial items (manuscript length, reference DOIs, and table and figure formatting) and Reviewer T’s suggestion to add figure captions. A full point-by-point response accompanies this resubmission; the summary below highlights the principal changes.</w:t>
       </w:r>
     </w:p>
     <w:bookmarkEnd w:id="9"/>
@@ -146,7 +146,7 @@
           <w:i/>
           <w:iCs/>
         </w:rPr>
-        <w:t xml:space="preserve">Engagement with recent literature and evidence (Editor; Reviewer Q3):</w:t>
+        <w:t xml:space="preserve">Manuscript length (Editor):</w:t>
       </w:r>
     </w:p>
     <w:p>
@@ -158,7 +158,7 @@
         </w:numPr>
       </w:pPr>
       <w:r>
-        <w:t xml:space="preserve">Added empirical evidence that human oversight measurably improves AI-generated analytics, including a prospective study in which human-verified large-language-model output exceeded a human-only workflow, and a text-to-SQL validation gate that improved semantic correctness.</w:t>
+        <w:t xml:space="preserve">The manuscript now measures 4,990 words under JMIR’s published counting method (title, abstract, keywords, body including table content and figure captions, and end matter; excluding references, author metadata, figure images, and appendices), within the 5,000-word Viewpoint limit. The prior submission measured approximately 5,430 words by the same method.</w:t>
       </w:r>
     </w:p>
     <w:p>
@@ -170,19 +170,7 @@
         </w:numPr>
       </w:pPr>
       <w:r>
-        <w:t xml:space="preserve">Added database query-log evidence on query reuse and diversity to address the scope and practicality of the framework.</w:t>
-      </w:r>
-    </w:p>
-    <w:p>
-      <w:pPr>
-        <w:pStyle w:val="Compact"/>
-        <w:numPr>
-          <w:ilvl w:val="0"/>
-          <w:numId w:val="1001"/>
-        </w:numPr>
-      </w:pPr>
-      <w:r>
-        <w:t xml:space="preserve">In total, 14 references spanning 1994-2026 were added, the majority from 2016-2026.</w:t>
+        <w:t xml:space="preserve">The full Three-Pillar Assessment Rubric (three tables with scoring anchors and evidence) moved to a new Multimedia Appendix 2, following JMIR’s guidance that lengthy tables are better suited to appendices; an abridged one-table summary remains in the main text. Prose and the abstract were tightened throughout. No reviewer-requested content from the first revision was removed.</w:t>
       </w:r>
     </w:p>
     <w:p>
@@ -194,7 +182,7 @@
           <w:i/>
           <w:iCs/>
         </w:rPr>
-        <w:t xml:space="preserve">Conceptual clarity (Reviewer T1):</w:t>
+        <w:t xml:space="preserve">Reference accuracy and validity (Editor):</w:t>
       </w:r>
     </w:p>
     <w:p>
@@ -206,7 +194,7 @@
         </w:numPr>
       </w:pPr>
       <w:r>
-        <w:t xml:space="preserve">Added explicit, cited definitions of the three title constructs (analytics maturity, workforce agility, and technical enablement) at the head of each evidence pillar, grounded in the established literature.</w:t>
+        <w:t xml:space="preserve">Every reference was audited for DOI registration, agreement with its registered Crossref metadata, and support for the claim cited to it. Eight incorrect or invalid DOIs were corrected, DOIs were added to six entries, two duplicate entries were removed, five references were removed or replaced with stronger established sources after verification, and author names and bibliographic fields were corrected against publisher records throughout. The revised list contains 84 references; every DOI resolves and matches its registered metadata.</w:t>
       </w:r>
     </w:p>
     <w:p>
@@ -218,7 +206,7 @@
           <w:i/>
           <w:iCs/>
         </w:rPr>
-        <w:t xml:space="preserve">Methodological caveats (Reviewer Q1, Q4):</w:t>
+        <w:t xml:space="preserve">Table and figure formatting (Editor):</w:t>
       </w:r>
     </w:p>
     <w:p>
@@ -230,19 +218,22 @@
         </w:numPr>
       </w:pPr>
       <w:r>
-        <w:t xml:space="preserve">Added a self-selection-bias caveat to the analytics-maturity evidence, grounded in the organizational-survey methodology literature.</w:t>
-      </w:r>
-    </w:p>
-    <w:p>
-      <w:pPr>
-        <w:pStyle w:val="Compact"/>
-        <w:numPr>
-          <w:ilvl w:val="0"/>
-          <w:numId w:val="1003"/>
-        </w:numPr>
-      </w:pPr>
-      <w:r>
-        <w:t xml:space="preserve">Added a Limitations paragraph acknowledging that the framework complements, rather than replaces, investment in workforce training and analytics literacy.</w:t>
+        <w:t xml:space="preserve">The root cause of the formatting problem was identified and fixed: the Word template style applied to tables defined no borders, so tables rendered as unaligned text. Tables now display with full gridlines, are numbered with captions above them (</w:t>
+      </w:r>
+      <w:r>
+        <w:t xml:space="preserve">“Table 1.”</w:t>
+      </w:r>
+      <w:r>
+        <w:t xml:space="preserve">,</w:t>
+      </w:r>
+      <w:r>
+        <w:t xml:space="preserve"> </w:t>
+      </w:r>
+      <w:r>
+        <w:t xml:space="preserve">“Table 2.”</w:t>
+      </w:r>
+      <w:r>
+        <w:t xml:space="preserve">), and are cited in the text. The dense rubric tables moved to Multimedia Appendix 2, which presents them as three bordered tables with a resolved reference list.</w:t>
       </w:r>
     </w:p>
     <w:p>
@@ -254,7 +245,7 @@
           <w:i/>
           <w:iCs/>
         </w:rPr>
-        <w:t xml:space="preserve">Currency and consolidation (Reviewer Q6; Reviewer T2, T4):</w:t>
+        <w:t xml:space="preserve">Figure captions (Reviewer T):</w:t>
       </w:r>
     </w:p>
     <w:p>
@@ -266,19 +257,22 @@
         </w:numPr>
       </w:pPr>
       <w:r>
-        <w:t xml:space="preserve">Replaced aging workforce statistics with contemporary (2021-2025) evidence; the single remaining two-decade-old reference is now framed explicitly as a historical benchmark.</w:t>
-      </w:r>
-    </w:p>
-    <w:p>
-      <w:pPr>
-        <w:pStyle w:val="Compact"/>
-        <w:numPr>
-          <w:ilvl w:val="0"/>
-          <w:numId w:val="1004"/>
-        </w:numPr>
-      </w:pPr>
-      <w:r>
-        <w:t xml:space="preserve">Consolidated duplicated turnover statistics to a single mention.</w:t>
+        <w:t xml:space="preserve">Each figure now carries a short numbered caption (</w:t>
+      </w:r>
+      <w:r>
+        <w:t xml:space="preserve">“Figure 1.”</w:t>
+      </w:r>
+      <w:r>
+        <w:t xml:space="preserve">,</w:t>
+      </w:r>
+      <w:r>
+        <w:t xml:space="preserve"> </w:t>
+      </w:r>
+      <w:r>
+        <w:t xml:space="preserve">“Figure 2.”</w:t>
+      </w:r>
+      <w:r>
+        <w:t xml:space="preserve">) followed by a brief explanatory footnote, replacing the long unnumbered descriptions that previously read as footnotes without captions.</w:t>
       </w:r>
     </w:p>
     <w:p>
@@ -290,7 +284,7 @@
           <w:i/>
           <w:iCs/>
         </w:rPr>
-        <w:t xml:space="preserve">Figure revision (Reviewer T3):</w:t>
+        <w:t xml:space="preserve">Future work (Reviewer Q):</w:t>
       </w:r>
     </w:p>
     <w:p>
@@ -302,7 +296,7 @@
         </w:numPr>
       </w:pPr>
       <w:r>
-        <w:t xml:space="preserve">Revised Figure 1 to add a feedback edge from Organizational Memory to the Knowledge Base, depicting continuous learning rather than a static knowledge base.</w:t>
+        <w:t xml:space="preserve">Reviewer Q’s two suggested directions (empirical assessment of the human-in-the-loop component and comparative evaluation against existing approaches) correspond to the priority questions identified in the manuscript’s Conclusion and are the design basis for a planned companion empirical study.</w:t>
       </w:r>
     </w:p>
     <w:p>
@@ -314,7 +308,7 @@
           <w:i/>
           <w:iCs/>
         </w:rPr>
-        <w:t xml:space="preserve">Formatting and compliance (Editor):</w:t>
+        <w:t xml:space="preserve">Voluntary corrections (disclosed in the point-by-point response):</w:t>
       </w:r>
     </w:p>
     <w:p>
@@ -326,43 +320,7 @@
         </w:numPr>
       </w:pPr>
       <w:r>
-        <w:t xml:space="preserve">Converted all in-text citations to numbered square brackets.</w:t>
-      </w:r>
-    </w:p>
-    <w:p>
-      <w:pPr>
-        <w:pStyle w:val="Compact"/>
-        <w:numPr>
-          <w:ilvl w:val="0"/>
-          <w:numId w:val="1006"/>
-        </w:numPr>
-      </w:pPr>
-      <w:r>
-        <w:t xml:space="preserve">Removed heading numbering and the italic sub-table titles that stood in place of subheadings.</w:t>
-      </w:r>
-    </w:p>
-    <w:p>
-      <w:pPr>
-        <w:pStyle w:val="Compact"/>
-        <w:numPr>
-          <w:ilvl w:val="0"/>
-          <w:numId w:val="1006"/>
-        </w:numPr>
-      </w:pPr>
-      <w:r>
-        <w:t xml:space="preserve">Added a Funding statement distinct from the Acknowledgments, and a generative-AI disclosure within the manuscript.</w:t>
-      </w:r>
-    </w:p>
-    <w:p>
-      <w:pPr>
-        <w:pStyle w:val="Compact"/>
-        <w:numPr>
-          <w:ilvl w:val="0"/>
-          <w:numId w:val="1006"/>
-        </w:numPr>
-      </w:pPr>
-      <w:r>
-        <w:t xml:space="preserve">Completed all reference details (volume, issue, pages, DOI) and the Abbreviations list, with acronyms defined at first use.</w:t>
+        <w:t xml:space="preserve">The reference audit prompted a small number of corrections beyond the requested items: the institutional-amnesia construct is now attributed to its public-administration and organization-science literatures rather than presented as newly defined; three statements were tightened to match their sources exactly; and one reference that became inaccessible at its publisher was replaced with an already-cited peer-reviewed source supporting the same point. The generative-AI disclosure in the Acknowledgments is unchanged and is re-attested in the response.</w:t>
       </w:r>
     </w:p>
     <w:p>
@@ -386,7 +344,7 @@
         <w:t xml:space="preserve"> </w:t>
       </w:r>
       <w:r>
-        <w:t xml:space="preserve">of 4,532 body words (within the 5,000-word limit) with an unstructured abstract of 304 words.</w:t>
+        <w:t xml:space="preserve">with an unstructured abstract of 270 words, two figures, two in-text tables, and two multimedia appendices.</w:t>
       </w:r>
     </w:p>
     <w:bookmarkEnd w:id="10"/>
@@ -420,7 +378,7 @@
         <w:t xml:space="preserve"> </w:t>
       </w:r>
       <w:r>
-        <w:t xml:space="preserve">article: an evidence-based scholarly perspective on mitigating institutional amnesia in healthcare analytics, grounded in peer-reviewed literature and knowledge management theory. As the Viewpoint article type does not permit IMRD section headings, descriptive thematic headers are used throughout, as detailed in the point-by-point response.</w:t>
+        <w:t xml:space="preserve">article: an evidence-based scholarly perspective on mitigating institutional amnesia in healthcare analytics, grounded in peer-reviewed literature and knowledge management theory. As the Viewpoint article type does not permit IMRD section headings, descriptive thematic headers are used throughout.</w:t>
       </w:r>
     </w:p>
     <w:p>
@@ -1246,17 +1204,25 @@
     <w:qFormat/>
     <w:tblPr>
       <w:tblInd w:type="dxa" w:w="0"/>
+      <w:tblBorders>
+        <w:top w:color="auto" w:space="0" w:sz="4" w:val="single"/>
+        <w:left w:color="auto" w:space="0" w:sz="4" w:val="single"/>
+        <w:bottom w:color="auto" w:space="0" w:sz="4" w:val="single"/>
+        <w:right w:color="auto" w:space="0" w:sz="4" w:val="single"/>
+        <w:insideH w:color="auto" w:space="0" w:sz="4" w:val="single"/>
+        <w:insideV w:color="auto" w:space="0" w:sz="4" w:val="single"/>
+      </w:tblBorders>
       <w:tblCellMar>
-        <w:top w:type="dxa" w:w="0"/>
+        <w:top w:type="dxa" w:w="40"/>
         <w:left w:type="dxa" w:w="108"/>
-        <w:bottom w:type="dxa" w:w="0"/>
+        <w:bottom w:type="dxa" w:w="40"/>
         <w:right w:type="dxa" w:w="108"/>
       </w:tblCellMar>
     </w:tblPr>
     <w:tblStylePr w:type="firstRow">
       <w:tcPr>
         <w:tcBorders>
-          <w:bottom w:val="single"/>
+          <w:bottom w:color="auto" w:space="0" w:sz="8" w:val="single"/>
         </w:tcBorders>
         <w:vAlign w:val="bottom"/>
       </w:tcPr>

</xml_diff>

<commit_message>
fix(docs): hard line breaks in cover letter signature block
The closing signature (name/affiliation/email) lacked markdown hard
line breaks and rendered as a single run-on line; now uses backslash
breaks matching the letterhead block. PDF/DOCX rebuilt; package
refreshed.

Refs #556

Co-Authored-By: Claude Fable 5 <noreply@anthropic.com>
</commit_message>
<xml_diff>
--- a/ARCHIVED/20260712_IJMR-Submission/cover-letter.docx
+++ b/ARCHIVED/20260712_IJMR-Submission/cover-letter.docx
@@ -405,13 +405,13 @@
         <w:t xml:space="preserve">Samuel T Harrold</w:t>
       </w:r>
       <w:r>
-        <w:t xml:space="preserve"> </w:t>
+        <w:br/>
       </w:r>
       <w:r>
         <w:t xml:space="preserve">Yuimedi, Inc.</w:t>
       </w:r>
       <w:r>
-        <w:t xml:space="preserve"> </w:t>
+        <w:br/>
       </w:r>
       <w:r>
         <w:t xml:space="preserve">samuel.harrold@yuimedi.com</w:t>

</xml_diff>